<commit_message>
NACIE TECDOC: refine normalization markers for table and figure references/captions
</commit_message>
<xml_diff>
--- a/05-build/02-nacie_tecdoc_master_chapter03_inserted.docx
+++ b/05-build/02-nacie_tecdoc_master_chapter03_inserted.docx
@@ -134,7 +134,7 @@
     <w:p>
       <w:pPr/>
       <w:r>
-        <w:t>The NACIE-UP facility is a rectangular loop composed of two vertical pipes (inner diameter 62.68 mm), with an overall height of approximately 7.7 m, and two horizontal pipes (inner diameter 62.68 mm) each 2.4 m in length. A prototypical wire-spaced fuel pin bundle simulator (FPS) is installed in the lower section of the riser. The FPS and its associated instrumentation are described in detail in subsequent sections. A heat exchanger (HX) is located in the upper portion of the downcomer, as illustrated in {FIG:chapter03_001}; a comprehensive description of the HX is provided later. The vertical distance between the center of the heated section and the center of the heat exchanger, H, is 5.5 m. For the experiments discussed in this work, only the high-power section of the heat exchanger was employed.</w:t>
+        <w:t>The NACIE-UP facility is a rectangular loop composed of two vertical pipes (inner diameter 62.68 mm), with an overall height of approximately 7.7 m, and two horizontal pipes (inner diameter 62.68 mm) each 2.4 m in length. A prototypical wire-spaced fuel pin bundle simulator (FPS) is installed in the lower section of the riser. The FPS and its associated instrumentation are described in detail in subsequent sections. A heat exchanger (HX) is located in the upper portion of the downcomer, as illustrated in {FIG_REF:chapter03_001}; a comprehensive description of the HX is provided later. The vertical distance between the center of the heated section and the center of the heat exchanger, H, is 5.5 m. For the experiments discussed in this work, only the high-power section of the heat exchanger was employed.</w:t>
       </w:r>
     </w:p>
     <w:p>
@@ -146,31 +146,31 @@
     <w:p>
       <w:pPr/>
       <w:r>
-        <w:t>The primary system is instrumented with eight bulk thermocouples (TP101–TP107 and TP310) to measure the fluid temperature along the flow path of the loop. The thermocouple locations are shown in {FIG:chapter03_002}. The FPS test section is equipped with a total of 67 thermocouples, arranged to monitor different subchannel ranks at various axial and radial positions.</w:t>
+        <w:t>The primary system is instrumented with eight bulk thermocouples (TP101–TP107 and TP310) to measure the fluid temperature along the flow path of the loop. The thermocouple locations are shown in {FIG_REF:chapter03_002}. The FPS test section is equipped with a total of 67 thermocouples, arranged to monitor different subchannel ranks at various axial and radial positions.</w:t>
       </w:r>
     </w:p>
     <w:p>
       <w:pPr/>
       <w:r>
-        <w:t>The primary loop is also thermally insulated with a mineral rock-wool layer bonded by a thermosetting resin. The thermal conductivity of the resin is temperature dependent, as reported in {TAB:chapter03_001} (manufacturer-provided data). The insulation thickness is 100 mm along the entire loop.</w:t>
+        <w:t>The primary loop is also thermally insulated with a mineral rock-wool layer bonded by a thermosetting resin. The thermal conductivity of the resin is temperature dependent, as reported in {TAB_REF:chapter03_001} (manufacturer-provided data). The insulation thickness is 100 mm along the entire loop.</w:t>
       </w:r>
     </w:p>
     <w:p>
       <w:pPr/>
       <w:r>
-        <w:t>{TAB:chapter03_001} Thermal conductivity (k) of the thermal insulator</w:t>
+        <w:t>{TAB_REF:chapter03_001} Thermal conductivity (k) of the thermal insulator</w:t>
       </w:r>
     </w:p>
     <w:p>
       <w:pPr/>
       <w:r>
-        <w:t>{FIG:chapter03_001}: Schematic representation of the NACIE-UP primary loop.</w:t>
+        <w:t>{FIG_REF:chapter03_001}: Schematic representation of the NACIE-UP primary loop.</w:t>
       </w:r>
     </w:p>
     <w:p>
       <w:pPr/>
       <w:r>
-        <w:t>{FIG:chapter03_002}: Layout of NACIE-UP facility.</w:t>
+        <w:t>{FIG_REF:chapter03_002}: Layout of NACIE-UP facility.</w:t>
       </w:r>
     </w:p>
     <w:p>
@@ -224,13 +224,13 @@
     <w:p>
       <w:pPr/>
       <w:r>
-        <w:t>A prototypical thermal flow meter (FM101) was used to measure the LBE mass flow rate in the loop. The thermal flow meter is based on the energy balance and it is shown schematically in {FIG:chapter03_003}.</w:t>
+        <w:t>A prototypical thermal flow meter (FM101) was used to measure the LBE mass flow rate in the loop. The thermal flow meter is based on the energy balance and it is shown schematically in {FIG_REF:chapter03_003}.</w:t>
       </w:r>
     </w:p>
     <w:p>
       <w:pPr/>
       <w:r>
-        <w:t>{FIG:chapter03_003}: Schematic view of the thermal flow meter.</w:t>
+        <w:t>{FIG_REF:chapter03_003}: Schematic view of the thermal flow meter.</w:t>
       </w:r>
     </w:p>
     <w:p>
@@ -280,13 +280,13 @@
     <w:p>
       <w:pPr/>
       <w:r>
-        <w:t>The FPS consists of 19 wire-spaced electrically heated pins arranged in a triangular lattice and enclosed by a dedicated hexagonal wrapper. Each pin has a diameter of D = 6.55 mm and a pitch-to-diameter ratio (P/D) of 1.2824. The total pin length, including the non-active sections and electrical connectors, is 2000 mm, while the heated (active) length is 600 mm. Spacer wires are helically wrapped around each pin with an axial pitch of Pw = 262 mm. The maximum thermal power of the bundle is approximately 250 kW, corresponding to a peak wall heat flux of about 1 MW/m². The main FPS design parameters are summarized in {TAB:chapter03_002}. The pin dimensions and overall structure are representative of the MYRRHA fuel assembly design.</w:t>
+        <w:t>The FPS consists of 19 wire-spaced electrically heated pins arranged in a triangular lattice and enclosed by a dedicated hexagonal wrapper. Each pin has a diameter of D = 6.55 mm and a pitch-to-diameter ratio (P/D) of 1.2824. The total pin length, including the non-active sections and electrical connectors, is 2000 mm, while the heated (active) length is 600 mm. Spacer wires are helically wrapped around each pin with an axial pitch of Pw = 262 mm. The maximum thermal power of the bundle is approximately 250 kW, corresponding to a peak wall heat flux of about 1 MW/m². The main FPS design parameters are summarized in {TAB_REF:chapter03_002}. The pin dimensions and overall structure are representative of the MYRRHA fuel assembly design.</w:t>
       </w:r>
     </w:p>
     <w:p>
       <w:pPr/>
       <w:r>
-        <w:t>The main geometrical dimensions of the fuel bundle, together with an overall sketch of the cross section, are shown in {FIG:chapter03_004}. The total flow area is conventionally subdivided into 54 subchannels of different ranks (S1–S54). The pins and subchannels are numbered to facilitate their identification and the reference to the associated instrumentation.</w:t>
+        <w:t>The main geometrical dimensions of the fuel bundle, together with an overall sketch of the cross section, are shown in {FIG_REF:chapter03_004}. The total flow area is conventionally subdivided into 54 subchannels of different ranks (S1–S54). The pins and subchannels are numbered to facilitate their identification and the reference to the associated instrumentation.</w:t>
       </w:r>
     </w:p>
     <w:p>
@@ -298,25 +298,25 @@
     <w:p>
       <w:pPr/>
       <w:r>
-        <w:t>The overall layout of the fuel pin bundle simulator, including its main dimensions, is illustrated in {FIG:chapter03_005} and provided separately. In addition, a detailed drawing of a single pin with the spacer wire is supplied. At the pin foot, a bottom grid is installed to maintain the structural integrity of the bundle, while the conical section allows elastic bending of the pins, which is required for the correct installation of the electrical connectors. A drawing of the bottom grid, which is the only component required for numerical fluid-dynamics modeling, is provided separately to the participants.</w:t>
+        <w:t>The overall layout of the fuel pin bundle simulator, including its main dimensions, is illustrated in {FIG_REF:chapter03_005} and provided separately. In addition, a detailed drawing of a single pin with the spacer wire is supplied. At the pin foot, a bottom grid is installed to maintain the structural integrity of the bundle, while the conical section allows elastic bending of the pins, which is required for the correct installation of the electrical connectors. A drawing of the bottom grid, which is the only component required for numerical fluid-dynamics modeling, is provided separately to the participants.</w:t>
       </w:r>
     </w:p>
     <w:p>
       <w:pPr/>
       <w:r>
-        <w:t>{TAB:chapter03_002}: FPS design parameters</w:t>
+        <w:t>{TAB_REF:chapter03_002}: FPS design parameters</w:t>
       </w:r>
     </w:p>
     <w:p>
       <w:pPr/>
       <w:r>
-        <w:t>{FIG:chapter03_004}: cross-section of the electrical wire-spaced FPS.</w:t>
+        <w:t>{FIG_REF:chapter03_004}: cross-section of the electrical wire-spaced FPS.</w:t>
       </w:r>
     </w:p>
     <w:p>
       <w:pPr/>
       <w:r>
-        <w:t>{FIG:chapter03_005} FPS layout.</w:t>
+        <w:t>{FIG_REF:chapter03_005} FPS layout.</w:t>
       </w:r>
     </w:p>
     <w:p>
@@ -330,7 +330,7 @@
     <w:p>
       <w:pPr/>
       <w:r>
-        <w:t>Pins No. 1, 2, 4, 5, 6, 7, 9, 16, 18, and 19 are instrumented with wall-embedded thermocouples located on one or more generatrices parallel to the pin axis, as summarized in {TAB:chapter03_003} and illustrated in {FIG:chapter03_006}. Three axial measurement levels are considered, at z = 38, 300, and 562 mm measured from the bottom of the active pin region, as shown in {FIG:chapter03_006}(a). By convention, the measurement planes at z = 38, 300, and 562 mm are referred to as Sections A, B, and C, respectively.</w:t>
+        <w:t>Pins No. 1, 2, 4, 5, 6, 7, 9, 16, 18, and 19 are instrumented with wall-embedded thermocouples located on one or more generatrices parallel to the pin axis, as summarized in {TAB_REF:chapter03_003} and illustrated in {FIG_REF:chapter03_006}. Three axial measurement levels are considered, at z = 38, 300, and 562 mm measured from the bottom of the active pin region, as shown in {FIG_REF:chapter03_006}(a). By convention, the measurement planes at z = 38, 300, and 562 mm are referred to as Sections A, B, and C, respectively.</w:t>
       </w:r>
     </w:p>
     <w:p>
@@ -342,37 +342,37 @@
     <w:p>
       <w:pPr/>
       <w:r>
-        <w:t>Subchannels S2, S5, S22, S26, and S33 are instrumented with bulk thermocouples of 0.5 mm diameter at the same three measurement sections A, B, and C (see {TAB:chapter03_004}). A schematic view of a generic measurement section, including both wall-embedded thermocouples and instrumented subchannels, is shown in {FIG:chapter03_006} (b). The relative positions of the grooves, i.e., the generatrices (highlighted in red) for the different pins, can also be inferred by considering the reference azimuthal pin angle θ, defined as positive in the anticlockwise direction when the bundle cross section is viewed from the top.</w:t>
+        <w:t>Subchannels S2, S5, S22, S26, and S33 are instrumented with bulk thermocouples of 0.5 mm diameter at the same three measurement sections A, B, and C (see {TAB_REF:chapter03_004}). A schematic view of a generic measurement section, including both wall-embedded thermocouples and instrumented subchannels, is shown in {FIG_REF:chapter03_006} (b). The relative positions of the grooves, i.e., the generatrices (highlighted in red) for the different pins, can also be inferred by considering the reference azimuthal pin angle θ, defined as positive in the anticlockwise direction when the bundle cross section is viewed from the top.</w:t>
       </w:r>
     </w:p>
     <w:p>
       <w:pPr/>
       <w:r>
-        <w:t>{TAB:chapter03_005} summarizes all the relevant information associated with the thermocouples, including the pin or wire number, thermocouple type (‘Wall’ or ‘Bulk’), thermocouple diameter, subchannel number for bulk thermocouples, azimuthal angle, axial z location measured from the beginning of the active region, and the corresponding measurement section (A, B, or C). In cases where the information is not defined, the symbol “–” is used.</w:t>
+        <w:t>{TAB_REF:chapter03_005} summarizes all the relevant information associated with the thermocouples, including the pin or wire number, thermocouple type (‘Wall’ or ‘Bulk’), thermocouple diameter, subchannel number for bulk thermocouples, azimuthal angle, axial z location measured from the beginning of the active region, and the corresponding measurement section (A, B, or C). In cases where the information is not defined, the symbol “–” is used.</w:t>
       </w:r>
     </w:p>
     <w:p>
       <w:pPr/>
       <w:r>
-        <w:t>{FIG:chapter03_006}: Axial (a) and section (b) locations of wall embedded and bulk TCs for pins n. 1,3, 2, 4, 5, 6, 7, 9, 16, 18, 19.</w:t>
+        <w:t>{FIG_REF:chapter03_006}: Axial (a) and section (b) locations of wall embedded and bulk TCs for pins n. 1,3, 2, 4, 5, 6, 7, 9, 16, 18, 19.</w:t>
       </w:r>
     </w:p>
     <w:p>
       <w:pPr/>
       <w:r>
-        <w:t>{TAB:chapter03_003}:Azimuthal angles of the pin generatrices where the wall embedded Thermocouples are located.</w:t>
+        <w:t>{TAB_REF:chapter03_003}:Azimuthal angles of the pin generatrices where the wall embedded Thermocouples are located.</w:t>
       </w:r>
     </w:p>
     <w:p>
       <w:pPr/>
       <w:r>
-        <w:t>{TAB:chapter03_004}: Azimuthal angles of the generatrices where the bulk Thermocouples are located for each sub-channel instrumented.</w:t>
+        <w:t>{TAB_REF:chapter03_004}: Azimuthal angles of the generatrices where the bulk Thermocouples are located for each sub-channel instrumented.</w:t>
       </w:r>
     </w:p>
     <w:p>
       <w:pPr/>
       <w:r>
-        <w:t>{TAB:chapter03_005}: Thermocouples names with all the relevant information associated.</w:t>
+        <w:t>{TAB_REF:chapter03_005}: Thermocouples names with all the relevant information associated.</w:t>
       </w:r>
     </w:p>
     <w:p>
@@ -386,7 +386,7 @@
     <w:p>
       <w:pPr/>
       <w:r>
-        <w:t>The heat exchanger is of the shell-and-tube type and is designed to transfer thermal power up to 250 kW. It consists of two separate shell sections: a low-power crossflow section (0–30 kW) and a high-power counter-current section (30–250 kW), both connected to the pressurized-water secondary side. The two sections can be independently drained and filled (see {FIG:chapter03_001} and {FIG:chapter03_002}). The tube geometry follows a “tube-in-tube” configuration, with an annular gap of 2.45 mm filled with AISI 316 powder.</w:t>
+        <w:t>The heat exchanger is of the shell-and-tube type and is designed to transfer thermal power up to 250 kW. It consists of two separate shell sections: a low-power crossflow section (0–30 kW) and a high-power counter-current section (30–250 kW), both connected to the pressurized-water secondary side. The two sections can be independently drained and filled (see {FIG_REF:chapter03_001} and {FIG_REF:chapter03_002}). The tube geometry follows a “tube-in-tube” configuration, with an annular gap of 2.45 mm filled with AISI 316 powder.</w:t>
       </w:r>
     </w:p>
     <w:p>
@@ -412,25 +412,25 @@
     <w:p>
       <w:pPr/>
       <w:r>
-        <w:t>The heat exchanger features double walls filled with AISI stainless-steel powder; therefore, an accurate numerical modeling of the heat exchanger is essential to correctly predict the average LBE temperature in the loop under all the investigated operating conditions. A technical drawing of the heat exchanger is provided in {FIG:chapter03_007}.</w:t>
+        <w:t>The heat exchanger features double walls filled with AISI stainless-steel powder; therefore, an accurate numerical modeling of the heat exchanger is essential to correctly predict the average LBE temperature in the loop under all the investigated operating conditions. A technical drawing of the heat exchanger is provided in {FIG_REF:chapter03_007}.</w:t>
       </w:r>
     </w:p>
     <w:p>
       <w:pPr/>
       <w:r>
-        <w:t>{FIG:chapter03_007} Technical drawing of the Heat Exchanger.</w:t>
+        <w:t>{FIG_REF:chapter03_007} Technical drawing of the Heat Exchanger.</w:t>
       </w:r>
     </w:p>
     <w:p>
       <w:pPr/>
       <w:r>
-        <w:t>During the blind phase of a previous benchmark conducted within the SESAME project, the predicted average temperatures were significantly lower than the corresponding experimental values for all three tests. As illustrated in {FIG:chapter03_008} for Test-3, the simulated average temperature remains well below the measured value throughout the entire test duration, with deviations ranging from approximately 50 to 30 °C relative to the experimental data.</w:t>
+        <w:t>During the blind phase of a previous benchmark conducted within the SESAME project, the predicted average temperatures were significantly lower than the corresponding experimental values for all three tests. As illustrated in {FIG_REF:chapter03_008} for Test-3, the simulated average temperature remains well below the measured value throughout the entire test duration, with deviations ranging from approximately 50 to 30 °C relative to the experimental data.</w:t>
       </w:r>
     </w:p>
     <w:p>
       <w:pPr/>
       <w:r>
-        <w:t>{FIG:chapter03_008}: Comparison of the average loop temperature (blind simulation and experimental data, Test-3).</w:t>
+        <w:t>{FIG_REF:chapter03_008}: Comparison of the average loop temperature (blind simulation and experimental data, Test-3).</w:t>
       </w:r>
     </w:p>
     <w:p>
@@ -442,7 +442,7 @@
     <w:p>
       <w:pPr/>
       <w:r>
-        <w:t>Based on more reliable experimental data {REF:chapter03_local_002}, it was concluded that the powder thermal conductivity assumed in the blind simulations was overestimated. The powder thermal conductivity reported in {REF:chapter03_local_002} is summarized in {FIG:chapter03_009}, which shows experimental correlations as a function of temperature for three increasing powder compaction levels, denoted as RUN 0.0, 1.0, and 5.0 (dotted lines). The figure also includes the thermal conductivity adopted in the blind RELAP5 simulations (blue line) and the updated value used in the post-test RELAP5 analyses (red line).</w:t>
+        <w:t>Based on more reliable experimental data {REF:chapter03_local_002}, it was concluded that the powder thermal conductivity assumed in the blind simulations was overestimated. The powder thermal conductivity reported in {REF:chapter03_local_002} is summarized in {FIG_REF:chapter03_009}, which shows experimental correlations as a function of temperature for three increasing powder compaction levels, denoted as RUN 0.0, 1.0, and 5.0 (dotted lines). The figure also includes the thermal conductivity adopted in the blind RELAP5 simulations (blue line) and the updated value used in the post-test RELAP5 analyses (red line).</w:t>
       </w:r>
     </w:p>
     <w:p>
@@ -466,7 +466,7 @@
     <w:p>
       <w:pPr/>
       <w:r>
-        <w:t>{FIG:chapter03_009}: Stainless steel powder thermal conductivity.</w:t>
+        <w:t>{FIG_REF:chapter03_009}: Stainless steel powder thermal conductivity.</w:t>
       </w:r>
     </w:p>
     <w:p>
@@ -480,7 +480,7 @@
     <w:p>
       <w:pPr/>
       <w:r>
-        <w:t>The gas injection device currently installed and used during the experimental tests is composed of a 12.70 mm (1/2 inch) outer-diameter pipe, 6135 mm in length, which is inserted through the 2½″ coupling flange located at the top of the expansion tank by means of a Swagelok tube fitting. Technical drawings of the terminal section of the device, including its functional dimensions, are shown in {FIG:chapter03_010}.</w:t>
+        <w:t>The gas injection device currently installed and used during the experimental tests is composed of a 12.70 mm (1/2 inch) outer-diameter pipe, 6135 mm in length, which is inserted through the 2½″ coupling flange located at the top of the expansion tank by means of a Swagelok tube fitting. Technical drawings of the terminal section of the device, including its functional dimensions, are shown in {FIG_REF:chapter03_010}.</w:t>
       </w:r>
     </w:p>
     <w:p>
@@ -492,7 +492,7 @@
     <w:p>
       <w:pPr/>
       <w:r>
-        <w:t>{FIG:chapter03_010}: Technical drawings of the gas injection device.</w:t>
+        <w:t>{FIG_REF:chapter03_010}: Technical drawings of the gas injection device.</w:t>
       </w:r>
     </w:p>
     <w:p>
@@ -524,13 +524,13 @@
     <w:p>
       <w:pPr/>
       <w:r>
-        <w:t>During circuit filling, the LBE level is above the LD102 sensor (LD102 active) but below the LD101 sensor (LD101 inactive). Nevertheless, LBE levels reaching the LD101 position are still acceptable for facility operation. The low-level sensor (LD102) is positioned 150 mm from the top of the incoming vertical nozzle (i.e., 150 + 285 = 435 mm from the bottom of the expansion vessel), while the high-level sensor (LD101) is located 230 mm from the top of the same nozzle. A cross-sectional view of the expansion vessel (S101) is shown in {FIG:chapter03_011}.</w:t>
+        <w:t>During circuit filling, the LBE level is above the LD102 sensor (LD102 active) but below the LD101 sensor (LD101 inactive). Nevertheless, LBE levels reaching the LD101 position are still acceptable for facility operation. The low-level sensor (LD102) is positioned 150 mm from the top of the incoming vertical nozzle (i.e., 150 + 285 = 435 mm from the bottom of the expansion vessel), while the high-level sensor (LD101) is located 230 mm from the top of the same nozzle. A cross-sectional view of the expansion vessel (S101) is shown in {FIG_REF:chapter03_011}.</w:t>
       </w:r>
     </w:p>
     <w:p>
       <w:pPr/>
       <w:r>
-        <w:t>{FIG:chapter03_011}: cross-section of expansion vessel.</w:t>
+        <w:t>{FIG_REF:chapter03_011}: cross-section of expansion vessel.</w:t>
       </w:r>
     </w:p>
     <w:p>
@@ -544,31 +544,31 @@
     <w:p>
       <w:pPr/>
       <w:r>
-        <w:t>The Data Acquisition and Control System (DACS) is implemented using LabVIEW System Design Software in combination with National Instruments hardware. Both the primary and secondary systems of the NACIE-UP facility are remotely controlled, and the filling and draining operations of the plant are also performed remotely. {FIG:chapter03_012} presents the control and monitoring interface used to remotely actuate components and valves, from which temperatures and pressures in the primary and secondary systems are continuously monitored.</w:t>
+        <w:t>The Data Acquisition and Control System (DACS) is implemented using LabVIEW System Design Software in combination with National Instruments hardware. Both the primary and secondary systems of the NACIE-UP facility are remotely controlled, and the filling and draining operations of the plant are also performed remotely. {FIG_REF:chapter03_012} presents the control and monitoring interface used to remotely actuate components and valves, from which temperatures and pressures in the primary and secondary systems are continuously monitored.</w:t>
       </w:r>
     </w:p>
     <w:p>
       <w:pPr/>
       <w:r>
-        <w:t>{FIG:chapter03_013} shows the remote-control panel dedicated to the activation and regulation of power generation. The power level, the number of energized pins, and the power ramp rate can be adjusted as required, as illustrated in the same figure. In addition, all wall and bulk thermocouples within the fuel pin bundle simulator can be continuously monitored through the interface shown in {FIG:chapter03_014}. Each pin can be controlled independently, enabling the execution of asymmetric heating tests for code validation purposes. Transitions between different power levels can also be performed through controlled power ramps.</w:t>
+        <w:t>{FIG_REF:chapter03_013} shows the remote-control panel dedicated to the activation and regulation of power generation. The power level, the number of energized pins, and the power ramp rate can be adjusted as required, as illustrated in the same figure. In addition, all wall and bulk thermocouples within the fuel pin bundle simulator can be continuously monitored through the interface shown in {FIG_REF:chapter03_014}. Each pin can be controlled independently, enabling the execution of asymmetric heating tests for code validation purposes. Transitions between different power levels can also be performed through controlled power ramps.</w:t>
       </w:r>
     </w:p>
     <w:p>
       <w:pPr/>
       <w:r>
-        <w:t>{FIG:chapter03_012}: Remote control panel of the NACIE-UP facility.</w:t>
+        <w:t>{FIG_REF:chapter03_012}: Remote control panel of the NACIE-UP facility.</w:t>
       </w:r>
     </w:p>
     <w:p>
       <w:pPr/>
       <w:r>
-        <w:t>{FIG:chapter03_013}: Control panel of the Fuel Pin simulator power.</w:t>
+        <w:t>{FIG_REF:chapter03_013}: Control panel of the Fuel Pin simulator power.</w:t>
       </w:r>
     </w:p>
     <w:p>
       <w:pPr/>
       <w:r>
-        <w:t>{FIG:chapter03_014}: Monitoring panel of the FPS temperatures.</w:t>
+        <w:t>{FIG_REF:chapter03_014}: Monitoring panel of the FPS temperatures.</w:t>
       </w:r>
     </w:p>
     <w:p>

</xml_diff>

<commit_message>
NACIE TECDOC: identify chapter03 equations and assemble numbered placeholders
</commit_message>
<xml_diff>
--- a/05-build/02-nacie_tecdoc_master_chapter03_inserted.docx
+++ b/05-build/02-nacie_tecdoc_master_chapter03_inserted.docx
@@ -427,47 +427,12 @@
         <w:t>The component is made by a flanged pipe (SS) with an heater developed by Thermocoax (6 kW maximum power), a static mixer, 2 Resistance Temperature Detector (RTD) and an internal RTD in the bulb. The mass flow rate will be computed by the thermal balance:</w:t>
       </w:r>
     </w:p>
-    <w:tbl>
-      <w:tblPr>
-        <w:tblStyle w:val="TableGrid"/>
-        <w:tblW w:type="auto" w:w="0"/>
-        <w:tblLook w:firstColumn="1" w:firstRow="1" w:lastColumn="0" w:lastRow="0" w:noHBand="0" w:noVBand="1" w:val="04A0"/>
-      </w:tblPr>
-      <w:tblGrid>
-        <w:gridCol w:w="2880"/>
-        <w:gridCol w:w="2880"/>
-        <w:gridCol w:w="2880"/>
-      </w:tblGrid>
-      <w:tr>
-        <w:tc>
-          <w:tcPr>
-            <w:tcW w:type="dxa" w:w="2880"/>
-          </w:tcPr>
-          <w:p>
-            <w:r/>
-          </w:p>
-        </w:tc>
-        <w:tc>
-          <w:tcPr>
-            <w:tcW w:type="dxa" w:w="2880"/>
-          </w:tcPr>
-          <w:p>
-            <w:r/>
-          </w:p>
-        </w:tc>
-        <w:tc>
-          <w:tcPr>
-            <w:tcW w:type="dxa" w:w="2880"/>
-          </w:tcPr>
-          <w:p>
-            <w:r>
-              <w:t>(1)</w:t>
-            </w:r>
-          </w:p>
-        </w:tc>
-      </w:tr>
-    </w:tbl>
-    <w:p/>
+    <w:p>
+      <w:pPr/>
+      <w:r>
+        <w:t>[Equation (1) omitted]</w:t>
+      </w:r>
+    </w:p>
     <w:p>
       <w:pPr/>
       <w:r>
@@ -7495,47 +7460,12 @@
         <w:t>A systematic post-test analysis performed with RELAP5 {REF:chapter03_local_003} allowed an analytical expression for the powder thermal conductivity to be derived, which is strongly recommended for adoption in the present benchmark:</w:t>
       </w:r>
     </w:p>
-    <w:tbl>
-      <w:tblPr>
-        <w:tblStyle w:val="TableGrid"/>
-        <w:tblW w:type="auto" w:w="0"/>
-        <w:tblLook w:firstColumn="1" w:firstRow="1" w:lastColumn="0" w:lastRow="0" w:noHBand="0" w:noVBand="1" w:val="04A0"/>
-      </w:tblPr>
-      <w:tblGrid>
-        <w:gridCol w:w="2880"/>
-        <w:gridCol w:w="2880"/>
-        <w:gridCol w:w="2880"/>
-      </w:tblGrid>
-      <w:tr>
-        <w:tc>
-          <w:tcPr>
-            <w:tcW w:type="dxa" w:w="2880"/>
-          </w:tcPr>
-          <w:p>
-            <w:r/>
-          </w:p>
-        </w:tc>
-        <w:tc>
-          <w:tcPr>
-            <w:tcW w:type="dxa" w:w="2880"/>
-          </w:tcPr>
-          <w:p>
-            <w:r/>
-          </w:p>
-        </w:tc>
-        <w:tc>
-          <w:tcPr>
-            <w:tcW w:type="dxa" w:w="2880"/>
-          </w:tcPr>
-          <w:p>
-            <w:r>
-              <w:t>(2)</w:t>
-            </w:r>
-          </w:p>
-        </w:tc>
-      </w:tr>
-    </w:tbl>
-    <w:p/>
+    <w:p>
+      <w:pPr/>
+      <w:r>
+        <w:t>[Equation (2) omitted]</w:t>
+      </w:r>
+    </w:p>
     <w:p>
       <w:pPr/>
       <w:r>

</xml_diff>

<commit_message>
NACIE TECDOC: add Chapter 3 equation extraction and assembly placeholders
</commit_message>
<xml_diff>
--- a/05-build/02-nacie_tecdoc_master_chapter03_inserted.docx
+++ b/05-build/02-nacie_tecdoc_master_chapter03_inserted.docx
@@ -427,16 +427,86 @@
         <w:t>The component is made by a flanged pipe (SS) with an heater developed by Thermocoax (6 kW maximum power), a static mixer, 2 Resistance Temperature Detector (RTD) and an internal RTD in the bulb. The mass flow rate will be computed by the thermal balance:</w:t>
       </w:r>
     </w:p>
+    <w:tbl>
+      <w:tblPr>
+        <w:tblW w:type="auto" w:w="0"/>
+        <w:tblLook w:firstColumn="1" w:firstRow="1" w:lastColumn="0" w:lastRow="0" w:noHBand="0" w:noVBand="1" w:val="04A0"/>
+        <w:tblBorders>
+          <w:top w:val="nil"/>
+          <w:left w:val="nil"/>
+          <w:bottom w:val="nil"/>
+          <w:right w:val="nil"/>
+          <w:insideH w:val="nil"/>
+          <w:insideV w:val="nil"/>
+        </w:tblBorders>
+      </w:tblPr>
+      <w:tblGrid>
+        <w:gridCol w:w="4680"/>
+        <w:gridCol w:w="4680"/>
+      </w:tblGrid>
+      <w:tr>
+        <w:tc>
+          <w:tcPr>
+            <w:tcW w:type="dxa" w:w="4680"/>
+          </w:tcPr>
+          <w:p>
+            <w:pPr/>
+            <w:r>
+              <w:drawing>
+                <wp:inline xmlns:a="http://schemas.openxmlformats.org/drawingml/2006/main" xmlns:pic="http://schemas.openxmlformats.org/drawingml/2006/picture">
+                  <wp:extent cx="914400" cy="304800"/>
+                  <wp:docPr id="1" name="Picture 1"/>
+                  <wp:cNvGraphicFramePr>
+                    <a:graphicFrameLocks noChangeAspect="1"/>
+                  </wp:cNvGraphicFramePr>
+                  <a:graphic>
+                    <a:graphicData uri="http://schemas.openxmlformats.org/drawingml/2006/picture">
+                      <pic:pic>
+                        <pic:nvPicPr>
+                          <pic:cNvPr id="0" name="chapter03_eq_001.png"/>
+                          <pic:cNvPicPr/>
+                        </pic:nvPicPr>
+                        <pic:blipFill>
+                          <a:blip r:embed="rId14"/>
+                          <a:stretch>
+                            <a:fillRect/>
+                          </a:stretch>
+                        </pic:blipFill>
+                        <pic:spPr>
+                          <a:xfrm>
+                            <a:off x="0" y="0"/>
+                            <a:ext cx="914400" cy="304800"/>
+                          </a:xfrm>
+                          <a:prstGeom prst="rect"/>
+                        </pic:spPr>
+                      </pic:pic>
+                    </a:graphicData>
+                  </a:graphic>
+                </wp:inline>
+              </w:drawing>
+            </w:r>
+          </w:p>
+        </w:tc>
+        <w:tc>
+          <w:tcPr>
+            <w:tcW w:type="dxa" w:w="4680"/>
+          </w:tcPr>
+          <w:p>
+            <w:pPr/>
+            <w:r>
+              <w:t>{EQ_CAP:chapter03_001}</w:t>
+            </w:r>
+          </w:p>
+        </w:tc>
+      </w:tr>
+    </w:tbl>
     <w:p>
       <w:pPr/>
-      <w:r>
-        <w:t>[Equation (1) omitted]</w:t>
-      </w:r>
     </w:p>
     <w:p>
       <w:pPr/>
       <w:r>
-        <w:t>Under steady-state conditions, Eq. (1) yields an accurate evaluation of the mass flow rate. During transient operation, the bulb heater is actively regulated to maintain a constant temperature difference between the heater and the inlet RTD. In addition, an inlet–outlet temperature compensation is implemented to account for the fluid transit time through the 800 mm pipe. These two features, implemented within the Data Acquisition and Control System (DACS) of the instrument, ensure a fast and accurate response under transient conditions.</w:t>
+        <w:t>Under steady-state conditions, {EQ_REF:chapter03_001} yields an accurate evaluation of the mass flow rate. During transient operation, the bulb heater is actively regulated to maintain a constant temperature difference between the heater and the inlet RTD. In addition, an inlet–outlet temperature compensation is implemented to account for the fluid transit time through the 800 mm pipe. These two features, implemented within the Data Acquisition and Control System (DACS) of the instrument, ensure a fast and accurate response under transient conditions.</w:t>
       </w:r>
     </w:p>
     <w:p>
@@ -7460,11 +7530,81 @@
         <w:t>A systematic post-test analysis performed with RELAP5 {REF:chapter03_local_003} allowed an analytical expression for the powder thermal conductivity to be derived, which is strongly recommended for adoption in the present benchmark:</w:t>
       </w:r>
     </w:p>
+    <w:tbl>
+      <w:tblPr>
+        <w:tblW w:type="auto" w:w="0"/>
+        <w:tblLook w:firstColumn="1" w:firstRow="1" w:lastColumn="0" w:lastRow="0" w:noHBand="0" w:noVBand="1" w:val="04A0"/>
+        <w:tblBorders>
+          <w:top w:val="nil"/>
+          <w:left w:val="nil"/>
+          <w:bottom w:val="nil"/>
+          <w:right w:val="nil"/>
+          <w:insideH w:val="nil"/>
+          <w:insideV w:val="nil"/>
+        </w:tblBorders>
+      </w:tblPr>
+      <w:tblGrid>
+        <w:gridCol w:w="4680"/>
+        <w:gridCol w:w="4680"/>
+      </w:tblGrid>
+      <w:tr>
+        <w:tc>
+          <w:tcPr>
+            <w:tcW w:type="dxa" w:w="4680"/>
+          </w:tcPr>
+          <w:p>
+            <w:pPr/>
+            <w:r>
+              <w:drawing>
+                <wp:inline xmlns:a="http://schemas.openxmlformats.org/drawingml/2006/main" xmlns:pic="http://schemas.openxmlformats.org/drawingml/2006/picture">
+                  <wp:extent cx="914400" cy="304800"/>
+                  <wp:docPr id="2" name="Picture 2"/>
+                  <wp:cNvGraphicFramePr>
+                    <a:graphicFrameLocks noChangeAspect="1"/>
+                  </wp:cNvGraphicFramePr>
+                  <a:graphic>
+                    <a:graphicData uri="http://schemas.openxmlformats.org/drawingml/2006/picture">
+                      <pic:pic>
+                        <pic:nvPicPr>
+                          <pic:cNvPr id="0" name="chapter03_eq_001.png"/>
+                          <pic:cNvPicPr/>
+                        </pic:nvPicPr>
+                        <pic:blipFill>
+                          <a:blip r:embed="rId14"/>
+                          <a:stretch>
+                            <a:fillRect/>
+                          </a:stretch>
+                        </pic:blipFill>
+                        <pic:spPr>
+                          <a:xfrm>
+                            <a:off x="0" y="0"/>
+                            <a:ext cx="914400" cy="304800"/>
+                          </a:xfrm>
+                          <a:prstGeom prst="rect"/>
+                        </pic:spPr>
+                      </pic:pic>
+                    </a:graphicData>
+                  </a:graphic>
+                </wp:inline>
+              </w:drawing>
+            </w:r>
+          </w:p>
+        </w:tc>
+        <w:tc>
+          <w:tcPr>
+            <w:tcW w:type="dxa" w:w="4680"/>
+          </w:tcPr>
+          <w:p>
+            <w:pPr/>
+            <w:r>
+              <w:t>{EQ_CAP:chapter03_002}</w:t>
+            </w:r>
+          </w:p>
+        </w:tc>
+      </w:tr>
+    </w:tbl>
     <w:p>
       <w:pPr/>
-      <w:r>
-        <w:t>[Equation (2) omitted]</w:t>
-      </w:r>
     </w:p>
     <w:p>
       <w:pPr/>

</xml_diff>

<commit_message>
NACIE TECDOC: preserve manual equation images and assemble Chapter 3 equations
</commit_message>
<xml_diff>
--- a/05-build/02-nacie_tecdoc_master_chapter03_inserted.docx
+++ b/05-build/02-nacie_tecdoc_master_chapter03_inserted.docx
@@ -454,7 +454,7 @@
             <w:r>
               <w:drawing>
                 <wp:inline xmlns:a="http://schemas.openxmlformats.org/drawingml/2006/main" xmlns:pic="http://schemas.openxmlformats.org/drawingml/2006/picture">
-                  <wp:extent cx="914400" cy="304800"/>
+                  <wp:extent cx="914400" cy="326466"/>
                   <wp:docPr id="1" name="Picture 1"/>
                   <wp:cNvGraphicFramePr>
                     <a:graphicFrameLocks noChangeAspect="1"/>
@@ -475,7 +475,7 @@
                         <pic:spPr>
                           <a:xfrm>
                             <a:off x="0" y="0"/>
-                            <a:ext cx="914400" cy="304800"/>
+                            <a:ext cx="914400" cy="326466"/>
                           </a:xfrm>
                           <a:prstGeom prst="rect"/>
                         </pic:spPr>
@@ -7557,7 +7557,7 @@
             <w:r>
               <w:drawing>
                 <wp:inline xmlns:a="http://schemas.openxmlformats.org/drawingml/2006/main" xmlns:pic="http://schemas.openxmlformats.org/drawingml/2006/picture">
-                  <wp:extent cx="914400" cy="304800"/>
+                  <wp:extent cx="914400" cy="106004"/>
                   <wp:docPr id="2" name="Picture 2"/>
                   <wp:cNvGraphicFramePr>
                     <a:graphicFrameLocks noChangeAspect="1"/>
@@ -7566,11 +7566,11 @@
                     <a:graphicData uri="http://schemas.openxmlformats.org/drawingml/2006/picture">
                       <pic:pic>
                         <pic:nvPicPr>
-                          <pic:cNvPr id="0" name="chapter03_eq_001.png"/>
+                          <pic:cNvPr id="0" name="chapter03_eq_002.png"/>
                           <pic:cNvPicPr/>
                         </pic:nvPicPr>
                         <pic:blipFill>
-                          <a:blip r:embed="rId14"/>
+                          <a:blip r:embed="rId15"/>
                           <a:stretch>
                             <a:fillRect/>
                           </a:stretch>
@@ -7578,7 +7578,7 @@
                         <pic:spPr>
                           <a:xfrm>
                             <a:off x="0" y="0"/>
-                            <a:ext cx="914400" cy="304800"/>
+                            <a:ext cx="914400" cy="106004"/>
                           </a:xfrm>
                           <a:prstGeom prst="rect"/>
                         </pic:spPr>

</xml_diff>